<commit_message>
add updated instructions for TMLI planning
</commit_message>
<xml_diff>
--- a/Planning Instructions for VMAT TMLI.docx
+++ b/Planning Instructions for VMAT TMLI.docx
@@ -91,6 +91,7 @@
         <w:rPr>
           <w:b/>
           <w:bCs/>
+          <w:highlight w:val="cyan"/>
         </w:rPr>
         <w:t>Prescription:</w:t>
       </w:r>
@@ -98,6 +99,7 @@
         <w:rPr>
           <w:b/>
           <w:bCs/>
+          <w:highlight w:val="cyan"/>
         </w:rPr>
         <w:t xml:space="preserve"> </w:t>
       </w:r>
@@ -105,6 +107,7 @@
         <w:rPr>
           <w:b/>
           <w:bCs/>
+          <w:highlight w:val="cyan"/>
         </w:rPr>
         <w:t xml:space="preserve">12 </w:t>
       </w:r>
@@ -113,6 +116,7 @@
         <w:rPr>
           <w:b/>
           <w:bCs/>
+          <w:highlight w:val="cyan"/>
         </w:rPr>
         <w:t>Gy</w:t>
       </w:r>
@@ -121,6 +125,7 @@
         <w:rPr>
           <w:b/>
           <w:bCs/>
+          <w:highlight w:val="cyan"/>
         </w:rPr>
         <w:t xml:space="preserve"> in </w:t>
       </w:r>
@@ -128,13 +133,15 @@
         <w:rPr>
           <w:b/>
           <w:bCs/>
-        </w:rPr>
-        <w:t>8</w:t>
-      </w:r>
-      <w:r>
-        <w:rPr>
-          <w:b/>
-          <w:bCs/>
+          <w:highlight w:val="cyan"/>
+        </w:rPr>
+        <w:t>6</w:t>
+      </w:r>
+      <w:r>
+        <w:rPr>
+          <w:b/>
+          <w:bCs/>
+          <w:highlight w:val="cyan"/>
         </w:rPr>
         <w:t xml:space="preserve"> </w:t>
       </w:r>
@@ -143,6 +150,7 @@
         <w:rPr>
           <w:b/>
           <w:bCs/>
+          <w:highlight w:val="cyan"/>
         </w:rPr>
         <w:t>fx</w:t>
       </w:r>
@@ -177,11 +185,31 @@
       </w:r>
       <w:proofErr w:type="spellStart"/>
       <w:r>
-        <w:t>Bones_Body</w:t>
-      </w:r>
-      <w:proofErr w:type="spellEnd"/>
-      <w:r>
-        <w:t xml:space="preserve"> – Mandible)</w:t>
+        <w:t>Bones_</w:t>
+      </w:r>
+      <w:r>
+        <w:t>Trunk</w:t>
+      </w:r>
+      <w:proofErr w:type="spellEnd"/>
+      <w:r>
+        <w:t xml:space="preserve"> – </w:t>
+      </w:r>
+      <w:proofErr w:type="spellStart"/>
+      <w:r>
+        <w:t>Bone</w:t>
+      </w:r>
+      <w:r>
+        <w:t>s</w:t>
+      </w:r>
+      <w:r>
+        <w:t>_</w:t>
+      </w:r>
+      <w:r>
+        <w:t>Face</w:t>
+      </w:r>
+      <w:proofErr w:type="spellEnd"/>
+      <w:r>
+        <w:t>)</w:t>
       </w:r>
       <w:r>
         <w:t xml:space="preserve"> + </w:t>
@@ -203,7 +231,16 @@
         <w:t xml:space="preserve"> + </w:t>
       </w:r>
       <w:r>
-        <w:t>Spleen) + 5mm all around] + [(</w:t>
+        <w:t xml:space="preserve">Spleen) + 5mm] + </w:t>
+      </w:r>
+      <w:r>
+        <w:t xml:space="preserve">[Rib + 7mm] </w:t>
+      </w:r>
+      <w:r>
+        <w:t xml:space="preserve">+ </w:t>
+      </w:r>
+      <w:r>
+        <w:t>[(</w:t>
       </w:r>
       <w:proofErr w:type="spellStart"/>
       <w:r>
@@ -217,188 +254,250 @@
         <w:t xml:space="preserve"> + </w:t>
       </w:r>
       <w:r>
-        <w:t>1cm all around] – [Lungs +5mm all around] – [Kidneys +5mm all around] – [Esophagus+5mm]</w:t>
+        <w:t>1cm] – [Lungs +</w:t>
+      </w:r>
+      <w:r>
+        <w:t>3</w:t>
+      </w:r>
+      <w:r>
+        <w:t>mm] – [Kidneys +</w:t>
+      </w:r>
+      <w:r>
+        <w:t>3</w:t>
+      </w:r>
+      <w:r>
+        <w:t>mm] – [</w:t>
+      </w:r>
+      <w:r>
+        <w:t>Eyes</w:t>
+      </w:r>
+      <w:r>
+        <w:t>+</w:t>
+      </w:r>
+      <w:r>
+        <w:t>3</w:t>
+      </w:r>
+      <w:r>
+        <w:t>mm]</w:t>
+      </w:r>
+    </w:p>
+    <w:p>
+      <w:pPr>
+        <w:rPr>
+          <w:b/>
+          <w:bCs/>
+        </w:rPr>
+      </w:pPr>
+      <w:r>
+        <w:rPr>
+          <w:b/>
+          <w:bCs/>
+          <w:highlight w:val="cyan"/>
+        </w:rPr>
+        <w:t xml:space="preserve">Prescription: 2 </w:t>
+      </w:r>
+      <w:proofErr w:type="spellStart"/>
+      <w:r>
+        <w:rPr>
+          <w:b/>
+          <w:bCs/>
+          <w:highlight w:val="cyan"/>
+        </w:rPr>
+        <w:t>Gy</w:t>
+      </w:r>
+      <w:proofErr w:type="spellEnd"/>
+      <w:r>
+        <w:rPr>
+          <w:b/>
+          <w:bCs/>
+          <w:highlight w:val="cyan"/>
+        </w:rPr>
+        <w:t xml:space="preserve"> in </w:t>
+      </w:r>
+      <w:r>
+        <w:rPr>
+          <w:b/>
+          <w:bCs/>
+          <w:highlight w:val="cyan"/>
+        </w:rPr>
+        <w:t>1</w:t>
+      </w:r>
+      <w:r>
+        <w:rPr>
+          <w:b/>
+          <w:bCs/>
+          <w:highlight w:val="cyan"/>
+        </w:rPr>
+        <w:t xml:space="preserve"> </w:t>
+      </w:r>
+      <w:proofErr w:type="spellStart"/>
+      <w:r>
+        <w:rPr>
+          <w:b/>
+          <w:bCs/>
+          <w:highlight w:val="cyan"/>
+        </w:rPr>
+        <w:t>fx</w:t>
+      </w:r>
+      <w:proofErr w:type="spellEnd"/>
+      <w:r>
+        <w:rPr>
+          <w:b/>
+          <w:bCs/>
+        </w:rPr>
+        <w:t xml:space="preserve"> </w:t>
+      </w:r>
+    </w:p>
+    <w:p>
+      <w:pPr>
+        <w:rPr>
+          <w:u w:val="single"/>
+        </w:rPr>
+      </w:pPr>
+      <w:r>
+        <w:rPr>
+          <w:u w:val="single"/>
+        </w:rPr>
+        <w:t>Target generation:</w:t>
+      </w:r>
+    </w:p>
+    <w:p>
+      <w:r>
+        <w:t>PTV_TMLI = [((</w:t>
+      </w:r>
+      <w:proofErr w:type="spellStart"/>
+      <w:r>
+        <w:t>Bones_Trunk</w:t>
+      </w:r>
+      <w:proofErr w:type="spellEnd"/>
+      <w:r>
+        <w:t xml:space="preserve"> – </w:t>
+      </w:r>
+      <w:proofErr w:type="spellStart"/>
+      <w:r>
+        <w:t>Bone</w:t>
+      </w:r>
+      <w:r>
+        <w:t>s</w:t>
+      </w:r>
+      <w:r>
+        <w:t>_</w:t>
+      </w:r>
+      <w:r>
+        <w:t>Face</w:t>
+      </w:r>
+      <w:proofErr w:type="spellEnd"/>
+      <w:r>
+        <w:t xml:space="preserve">) + </w:t>
+      </w:r>
+      <w:proofErr w:type="spellStart"/>
+      <w:r>
+        <w:t>LymphNodes</w:t>
+      </w:r>
+      <w:proofErr w:type="spellEnd"/>
+      <w:r>
+        <w:t xml:space="preserve"> + </w:t>
+      </w:r>
+      <w:proofErr w:type="spellStart"/>
+      <w:r>
+        <w:t>SpinalCanal</w:t>
+      </w:r>
+      <w:proofErr w:type="spellEnd"/>
+      <w:r>
+        <w:t xml:space="preserve"> + Spleen) + 5mm] +</w:t>
+      </w:r>
+      <w:r>
+        <w:t xml:space="preserve"> [Rib + 7mm] +</w:t>
+      </w:r>
+      <w:r>
+        <w:t xml:space="preserve"> [(</w:t>
+      </w:r>
+      <w:proofErr w:type="spellStart"/>
+      <w:r>
+        <w:t>Bones_Extrem</w:t>
+      </w:r>
+      <w:proofErr w:type="spellEnd"/>
+      <w:r>
+        <w:t>) + 1cm] – [Lungs</w:t>
+      </w:r>
+      <w:r>
+        <w:t>+3mm</w:t>
+      </w:r>
+      <w:r>
+        <w:t xml:space="preserve">] – [Kidneys +3mm] – </w:t>
+      </w:r>
+      <w:r>
+        <w:t xml:space="preserve">[Heart+3mm] - </w:t>
+      </w:r>
+      <w:r>
+        <w:t>[</w:t>
+      </w:r>
+      <w:r>
+        <w:t>Eyes</w:t>
+      </w:r>
+      <w:r>
+        <w:t>+3mm]</w:t>
+      </w:r>
+      <w:r>
+        <w:t xml:space="preserve"> – [Thyroid+3mm] – [Ovaries/Testes+2cm]</w:t>
+      </w:r>
+      <w:r>
+        <w:t xml:space="preserve"> cropped 3mm from skin</w:t>
       </w:r>
     </w:p>
     <w:p/>
     <w:p>
-      <w:pPr>
-        <w:rPr>
-          <w:b/>
-          <w:bCs/>
-        </w:rPr>
-      </w:pPr>
-      <w:r>
-        <w:rPr>
-          <w:b/>
-          <w:bCs/>
-        </w:rPr>
-        <w:t xml:space="preserve">Prescription: </w:t>
-      </w:r>
-      <w:r>
-        <w:rPr>
-          <w:b/>
-          <w:bCs/>
-        </w:rPr>
-        <w:t>20</w:t>
-      </w:r>
-      <w:r>
-        <w:rPr>
-          <w:b/>
-          <w:bCs/>
-        </w:rPr>
-        <w:t xml:space="preserve"> </w:t>
-      </w:r>
-      <w:proofErr w:type="spellStart"/>
-      <w:r>
-        <w:rPr>
-          <w:b/>
-          <w:bCs/>
-        </w:rPr>
-        <w:t>Gy</w:t>
-      </w:r>
-      <w:proofErr w:type="spellEnd"/>
-      <w:r>
-        <w:rPr>
-          <w:b/>
-          <w:bCs/>
-        </w:rPr>
-        <w:t xml:space="preserve"> in </w:t>
-      </w:r>
-      <w:r>
-        <w:rPr>
-          <w:b/>
-          <w:bCs/>
-        </w:rPr>
-        <w:t>10</w:t>
-      </w:r>
-      <w:r>
-        <w:rPr>
-          <w:b/>
-          <w:bCs/>
-        </w:rPr>
-        <w:t xml:space="preserve"> </w:t>
-      </w:r>
-      <w:proofErr w:type="spellStart"/>
-      <w:r>
-        <w:rPr>
-          <w:b/>
-          <w:bCs/>
-        </w:rPr>
-        <w:t>fx</w:t>
-      </w:r>
-      <w:proofErr w:type="spellEnd"/>
-      <w:r>
-        <w:rPr>
-          <w:b/>
-          <w:bCs/>
-        </w:rPr>
-        <w:t xml:space="preserve"> </w:t>
-      </w:r>
-      <w:r>
-        <w:rPr>
-          <w:b/>
-          <w:bCs/>
-        </w:rPr>
-        <w:t xml:space="preserve">(12 </w:t>
-      </w:r>
-      <w:proofErr w:type="spellStart"/>
-      <w:r>
-        <w:rPr>
-          <w:b/>
-          <w:bCs/>
-        </w:rPr>
-        <w:t>Gy</w:t>
-      </w:r>
-      <w:proofErr w:type="spellEnd"/>
-      <w:r>
-        <w:rPr>
-          <w:b/>
-          <w:bCs/>
-        </w:rPr>
-        <w:t xml:space="preserve"> to liver and brain only)</w:t>
-      </w:r>
-    </w:p>
-    <w:p>
-      <w:r>
-        <w:t>PTV_TMLI = [((</w:t>
-      </w:r>
-      <w:proofErr w:type="spellStart"/>
-      <w:r>
-        <w:t>Bones_Body</w:t>
-      </w:r>
-      <w:proofErr w:type="spellEnd"/>
-      <w:r>
-        <w:t xml:space="preserve"> – Mandible) + </w:t>
-      </w:r>
-      <w:proofErr w:type="spellStart"/>
-      <w:r>
-        <w:t>LymphNodes</w:t>
-      </w:r>
-      <w:proofErr w:type="spellEnd"/>
-      <w:r>
-        <w:t xml:space="preserve"> + </w:t>
-      </w:r>
-      <w:proofErr w:type="spellStart"/>
-      <w:r>
-        <w:t>SpinalCanal</w:t>
-      </w:r>
-      <w:proofErr w:type="spellEnd"/>
-      <w:r>
-        <w:t xml:space="preserve"> + Spleen) + 5mm all around] + [(</w:t>
-      </w:r>
-      <w:proofErr w:type="spellStart"/>
-      <w:r>
-        <w:t>Bones_Extrem</w:t>
-      </w:r>
-      <w:proofErr w:type="spellEnd"/>
-      <w:r>
-        <w:t>) + 1cm all around] – [Lungs +5mm all around] – [Kidneys +5mm all around] – [Esophagus+5mm]</w:t>
-      </w:r>
-    </w:p>
-    <w:p>
-      <w:r>
-        <w:t>PTV_1200 = [Brain + Liver] + 5mm all around</w:t>
-      </w:r>
-    </w:p>
-    <w:p/>
-    <w:p/>
-    <w:p>
-      <w:r>
-        <w:t>PTV_TMLI = [((</w:t>
-      </w:r>
-      <w:proofErr w:type="spellStart"/>
-      <w:r>
-        <w:t>Bones_Body</w:t>
-      </w:r>
-      <w:proofErr w:type="spellEnd"/>
-      <w:r>
-        <w:t xml:space="preserve"> – Mandible) + </w:t>
-      </w:r>
-      <w:proofErr w:type="spellStart"/>
-      <w:r>
-        <w:t>LymphNodes</w:t>
-      </w:r>
-      <w:proofErr w:type="spellEnd"/>
-      <w:r>
-        <w:t xml:space="preserve"> + </w:t>
-      </w:r>
-      <w:proofErr w:type="spellStart"/>
-      <w:r>
-        <w:t>SpinalCanal</w:t>
-      </w:r>
-      <w:proofErr w:type="spellEnd"/>
-      <w:r>
-        <w:t xml:space="preserve"> + Spleen + Brain + Liver + Testes) + 5mm all around] + [(</w:t>
-      </w:r>
-      <w:proofErr w:type="spellStart"/>
-      <w:r>
-        <w:t>Bones_Extrem</w:t>
-      </w:r>
-      <w:proofErr w:type="spellEnd"/>
-      <w:r>
-        <w:t>) + 1cm all around] – [Lungs +5mm all around] – [Kidneys +5mm all around] – [Esophagus+5mm]</w:t>
-      </w:r>
+      <w:r>
+        <w:t>Nested structures:</w:t>
+      </w:r>
+    </w:p>
+    <w:p>
+      <w:r>
+        <w:t>Lungs</w:t>
+      </w:r>
+      <w:r>
+        <w:t>-1cm/-2cm</w:t>
+      </w:r>
+      <w:r>
+        <w:t>, kidneys</w:t>
+      </w:r>
+      <w:r>
+        <w:t>-1cm</w:t>
+      </w:r>
+      <w:r>
+        <w:t>, liver</w:t>
+      </w:r>
+      <w:r>
+        <w:t>-1cm/-2cm</w:t>
+      </w:r>
+      <w:r>
+        <w:t>, brain</w:t>
+      </w:r>
+      <w:r>
+        <w:t>-1cm/-2cm</w:t>
+      </w:r>
+      <w:r>
+        <w:t>, heart</w:t>
+      </w:r>
+      <w:r>
+        <w:t>-1cm/2cm</w:t>
+      </w:r>
+      <w:r>
+        <w:t>, testes</w:t>
+      </w:r>
+      <w:r>
+        <w:t>-1cm</w:t>
+      </w:r>
+    </w:p>
+    <w:p>
+      <w:r>
+        <w:t xml:space="preserve">TS_Ring_6Gy (1.5cm thick, 1.5cm from PTV_TMLI) ask for 50% of Rx as </w:t>
+      </w:r>
+      <w:proofErr w:type="spellStart"/>
+      <w:r>
+        <w:t>Dmax</w:t>
+      </w:r>
+      <w:proofErr w:type="spellEnd"/>
     </w:p>
     <w:p/>
     <w:p>
@@ -428,7 +527,10 @@
       </w:pPr>
       <w:proofErr w:type="spellStart"/>
       <w:r>
-        <w:t>Globe_R</w:t>
+        <w:t>Eye</w:t>
+      </w:r>
+      <w:r>
+        <w:t>_R</w:t>
       </w:r>
       <w:proofErr w:type="spellEnd"/>
       <w:r>
@@ -442,7 +544,10 @@
       </w:pPr>
       <w:proofErr w:type="spellStart"/>
       <w:r>
-        <w:t>Globe_L</w:t>
+        <w:t>Eye</w:t>
+      </w:r>
+      <w:r>
+        <w:t>_L</w:t>
       </w:r>
       <w:proofErr w:type="spellEnd"/>
     </w:p>
@@ -497,65 +602,91 @@
       </w:pPr>
       <w:proofErr w:type="spellStart"/>
       <w:r>
-        <w:t>Submand_R</w:t>
-      </w:r>
-      <w:proofErr w:type="spellEnd"/>
-    </w:p>
-    <w:p>
-      <w:pPr>
-        <w:spacing w:line="240" w:lineRule="auto"/>
-        <w:contextualSpacing/>
-      </w:pPr>
-      <w:proofErr w:type="spellStart"/>
-      <w:r>
-        <w:t>Submand_L</w:t>
-      </w:r>
-      <w:proofErr w:type="spellEnd"/>
-    </w:p>
-    <w:p>
-      <w:pPr>
-        <w:spacing w:line="240" w:lineRule="auto"/>
-        <w:contextualSpacing/>
-      </w:pPr>
-      <w:proofErr w:type="spellStart"/>
-      <w:r>
-        <w:t>Oral_Cavity</w:t>
-      </w:r>
-      <w:proofErr w:type="spellEnd"/>
-    </w:p>
-    <w:p>
-      <w:pPr>
-        <w:spacing w:line="240" w:lineRule="auto"/>
-        <w:contextualSpacing/>
-      </w:pPr>
-      <w:proofErr w:type="spellStart"/>
-      <w:r>
-        <w:t>Optic_Nerve_R</w:t>
-      </w:r>
-      <w:proofErr w:type="spellEnd"/>
-    </w:p>
-    <w:p>
-      <w:pPr>
-        <w:spacing w:line="240" w:lineRule="auto"/>
-        <w:contextualSpacing/>
-      </w:pPr>
-      <w:proofErr w:type="spellStart"/>
-      <w:r>
-        <w:t>Optic_Nerve_</w:t>
-      </w:r>
-      <w:r>
-        <w:t>L</w:t>
-      </w:r>
-      <w:proofErr w:type="spellEnd"/>
-    </w:p>
-    <w:p>
-      <w:pPr>
-        <w:spacing w:line="240" w:lineRule="auto"/>
-        <w:contextualSpacing/>
-      </w:pPr>
+        <w:t>Glnd_submand</w:t>
+      </w:r>
+      <w:r>
+        <w:t>_R</w:t>
+      </w:r>
+      <w:proofErr w:type="spellEnd"/>
+    </w:p>
+    <w:p>
+      <w:pPr>
+        <w:spacing w:line="240" w:lineRule="auto"/>
+        <w:contextualSpacing/>
+      </w:pPr>
+      <w:proofErr w:type="spellStart"/>
+      <w:r>
+        <w:t>Glnd_submand</w:t>
+      </w:r>
+      <w:proofErr w:type="spellEnd"/>
+      <w:r>
+        <w:t xml:space="preserve"> </w:t>
+      </w:r>
+      <w:r>
+        <w:t>_L</w:t>
+      </w:r>
+    </w:p>
+    <w:p>
+      <w:pPr>
+        <w:spacing w:line="240" w:lineRule="auto"/>
+        <w:contextualSpacing/>
+      </w:pPr>
+      <w:proofErr w:type="spellStart"/>
+      <w:r>
+        <w:t>Cavity</w:t>
+      </w:r>
+      <w:r>
+        <w:t>_Oral</w:t>
+      </w:r>
+      <w:proofErr w:type="spellEnd"/>
+    </w:p>
+    <w:p>
+      <w:pPr>
+        <w:spacing w:line="240" w:lineRule="auto"/>
+        <w:contextualSpacing/>
+      </w:pPr>
+      <w:proofErr w:type="spellStart"/>
+      <w:r>
+        <w:t>OpticN</w:t>
+      </w:r>
+      <w:r>
+        <w:t>rv</w:t>
+      </w:r>
+      <w:r>
+        <w:t>_R</w:t>
+      </w:r>
+      <w:proofErr w:type="spellEnd"/>
+    </w:p>
+    <w:p>
+      <w:pPr>
+        <w:spacing w:line="240" w:lineRule="auto"/>
+        <w:contextualSpacing/>
+      </w:pPr>
+      <w:proofErr w:type="spellStart"/>
+      <w:r>
+        <w:t>OpticN</w:t>
+      </w:r>
+      <w:r>
+        <w:t>rv</w:t>
+      </w:r>
+      <w:r>
+        <w:t>_L</w:t>
+      </w:r>
+      <w:proofErr w:type="spellEnd"/>
+    </w:p>
+    <w:p>
+      <w:pPr>
+        <w:spacing w:line="240" w:lineRule="auto"/>
+        <w:contextualSpacing/>
+      </w:pPr>
+      <w:proofErr w:type="spellStart"/>
+      <w:r>
+        <w:t>Optic</w:t>
+      </w:r>
       <w:r>
         <w:t>Chiasm</w:t>
       </w:r>
+      <w:proofErr w:type="spellEnd"/>
     </w:p>
     <w:p>
       <w:pPr>
@@ -659,13 +790,7 @@
         <w:rPr>
           <w:highlight w:val="yellow"/>
         </w:rPr>
-        <w:t xml:space="preserve"> - </w:t>
-      </w:r>
-      <w:r>
-        <w:rPr>
-          <w:highlight w:val="yellow"/>
-        </w:rPr>
-        <w:t>Limbus</w:t>
+        <w:t xml:space="preserve"> - Limbus</w:t>
       </w:r>
     </w:p>
     <w:p>
@@ -702,161 +827,277 @@
         <w:rPr>
           <w:highlight w:val="yellow"/>
         </w:rPr>
+        <w:t>Bladder</w:t>
+      </w:r>
+      <w:r>
+        <w:rPr>
+          <w:highlight w:val="yellow"/>
+        </w:rPr>
+        <w:t xml:space="preserve"> - Limbus</w:t>
+      </w:r>
+    </w:p>
+    <w:p>
+      <w:pPr>
+        <w:spacing w:line="240" w:lineRule="auto"/>
+        <w:contextualSpacing/>
+      </w:pPr>
+      <w:r>
+        <w:rPr>
+          <w:highlight w:val="yellow"/>
+        </w:rPr>
+        <w:t>Rectum</w:t>
+      </w:r>
+      <w:r>
+        <w:rPr>
+          <w:highlight w:val="yellow"/>
+        </w:rPr>
+        <w:t xml:space="preserve"> - Limbus</w:t>
+      </w:r>
+    </w:p>
+    <w:p>
+      <w:pPr>
+        <w:spacing w:line="240" w:lineRule="auto"/>
+        <w:contextualSpacing/>
+        <w:rPr>
+          <w:highlight w:val="yellow"/>
+        </w:rPr>
+      </w:pPr>
+      <w:proofErr w:type="spellStart"/>
+      <w:r>
+        <w:rPr>
+          <w:highlight w:val="yellow"/>
+        </w:rPr>
+        <w:t>Breast_R</w:t>
+      </w:r>
+      <w:proofErr w:type="spellEnd"/>
+      <w:r>
+        <w:rPr>
+          <w:highlight w:val="yellow"/>
+        </w:rPr>
+        <w:t xml:space="preserve"> - Limbus</w:t>
+      </w:r>
+    </w:p>
+    <w:p>
+      <w:pPr>
+        <w:spacing w:line="240" w:lineRule="auto"/>
+        <w:contextualSpacing/>
+        <w:rPr>
+          <w:highlight w:val="yellow"/>
+        </w:rPr>
+      </w:pPr>
+      <w:proofErr w:type="spellStart"/>
+      <w:r>
+        <w:rPr>
+          <w:highlight w:val="yellow"/>
+        </w:rPr>
+        <w:t>Breast_L</w:t>
+      </w:r>
+      <w:proofErr w:type="spellEnd"/>
+      <w:r>
+        <w:rPr>
+          <w:highlight w:val="yellow"/>
+        </w:rPr>
+        <w:t xml:space="preserve"> - Limbus</w:t>
+      </w:r>
+    </w:p>
+    <w:p>
+      <w:pPr>
+        <w:spacing w:line="240" w:lineRule="auto"/>
+        <w:contextualSpacing/>
+        <w:rPr>
+          <w:highlight w:val="cyan"/>
+        </w:rPr>
+      </w:pPr>
+      <w:proofErr w:type="spellStart"/>
+      <w:r>
+        <w:rPr>
+          <w:highlight w:val="cyan"/>
+        </w:rPr>
+        <w:t>Ovary_R</w:t>
+      </w:r>
+      <w:proofErr w:type="spellEnd"/>
+    </w:p>
+    <w:p>
+      <w:pPr>
+        <w:spacing w:line="240" w:lineRule="auto"/>
+        <w:contextualSpacing/>
+      </w:pPr>
+      <w:proofErr w:type="spellStart"/>
+      <w:r>
+        <w:rPr>
+          <w:highlight w:val="cyan"/>
+        </w:rPr>
+        <w:t>Ovary_L</w:t>
+      </w:r>
+      <w:proofErr w:type="spellEnd"/>
+    </w:p>
+    <w:p>
+      <w:pPr>
+        <w:spacing w:line="240" w:lineRule="auto"/>
+        <w:contextualSpacing/>
+        <w:rPr>
+          <w:highlight w:val="yellow"/>
+        </w:rPr>
+      </w:pPr>
+      <w:proofErr w:type="spellStart"/>
+      <w:r>
+        <w:rPr>
+          <w:highlight w:val="yellow"/>
+        </w:rPr>
+        <w:t>Uterus</w:t>
+      </w:r>
+      <w:r>
+        <w:rPr>
+          <w:highlight w:val="yellow"/>
+        </w:rPr>
+        <w:t>_Cervix</w:t>
+      </w:r>
+      <w:proofErr w:type="spellEnd"/>
+      <w:r>
+        <w:rPr>
+          <w:highlight w:val="yellow"/>
+        </w:rPr>
+        <w:t xml:space="preserve"> - Limbus</w:t>
+      </w:r>
+    </w:p>
+    <w:p>
+      <w:pPr>
+        <w:spacing w:line="240" w:lineRule="auto"/>
+        <w:contextualSpacing/>
+      </w:pPr>
+      <w:r>
+        <w:rPr>
+          <w:highlight w:val="cyan"/>
+        </w:rPr>
+        <w:t>Testes</w:t>
+      </w:r>
+      <w:r>
+        <w:rPr>
+          <w:highlight w:val="cyan"/>
+        </w:rPr>
+        <w:t xml:space="preserve"> </w:t>
+      </w:r>
+    </w:p>
+    <w:p>
+      <w:pPr>
+        <w:spacing w:line="240" w:lineRule="auto"/>
+        <w:contextualSpacing/>
+      </w:pPr>
+      <w:r>
         <w:lastRenderedPageBreak/>
-        <w:t>Bladder</w:t>
-      </w:r>
-      <w:r>
-        <w:rPr>
-          <w:highlight w:val="yellow"/>
-        </w:rPr>
-        <w:t xml:space="preserve"> - </w:t>
-      </w:r>
-      <w:r>
-        <w:rPr>
-          <w:highlight w:val="yellow"/>
-        </w:rPr>
-        <w:t>Limbus</w:t>
-      </w:r>
-    </w:p>
-    <w:p>
-      <w:pPr>
-        <w:spacing w:line="240" w:lineRule="auto"/>
-        <w:contextualSpacing/>
-      </w:pPr>
-      <w:r>
-        <w:rPr>
-          <w:highlight w:val="yellow"/>
-        </w:rPr>
-        <w:t>Rectum</w:t>
-      </w:r>
-      <w:r>
-        <w:rPr>
-          <w:highlight w:val="yellow"/>
-        </w:rPr>
-        <w:t xml:space="preserve"> - </w:t>
-      </w:r>
-      <w:r>
-        <w:rPr>
-          <w:highlight w:val="yellow"/>
-        </w:rPr>
-        <w:t>Limbus</w:t>
-      </w:r>
-    </w:p>
-    <w:p>
-      <w:pPr>
-        <w:spacing w:line="240" w:lineRule="auto"/>
-        <w:contextualSpacing/>
-        <w:rPr>
-          <w:highlight w:val="yellow"/>
-        </w:rPr>
-      </w:pPr>
-      <w:proofErr w:type="spellStart"/>
-      <w:r>
-        <w:rPr>
-          <w:highlight w:val="yellow"/>
-        </w:rPr>
-        <w:t>Breast_R</w:t>
-      </w:r>
-      <w:proofErr w:type="spellEnd"/>
-      <w:r>
-        <w:rPr>
-          <w:highlight w:val="yellow"/>
-        </w:rPr>
-        <w:t xml:space="preserve"> - </w:t>
-      </w:r>
-      <w:r>
-        <w:rPr>
-          <w:highlight w:val="yellow"/>
-        </w:rPr>
-        <w:t>Limbus</w:t>
-      </w:r>
-    </w:p>
-    <w:p>
-      <w:pPr>
-        <w:spacing w:line="240" w:lineRule="auto"/>
-        <w:contextualSpacing/>
-        <w:rPr>
-          <w:highlight w:val="yellow"/>
-        </w:rPr>
-      </w:pPr>
-      <w:proofErr w:type="spellStart"/>
-      <w:r>
-        <w:rPr>
-          <w:highlight w:val="yellow"/>
-        </w:rPr>
-        <w:t>Breast_L</w:t>
-      </w:r>
-      <w:proofErr w:type="spellEnd"/>
-      <w:r>
-        <w:rPr>
-          <w:highlight w:val="yellow"/>
-        </w:rPr>
-        <w:t xml:space="preserve"> - </w:t>
-      </w:r>
-      <w:r>
-        <w:rPr>
-          <w:highlight w:val="yellow"/>
-        </w:rPr>
-        <w:t>Limbus</w:t>
-      </w:r>
-    </w:p>
-    <w:p>
-      <w:pPr>
-        <w:spacing w:line="240" w:lineRule="auto"/>
-        <w:contextualSpacing/>
-        <w:rPr>
-          <w:highlight w:val="cyan"/>
-        </w:rPr>
-      </w:pPr>
-      <w:proofErr w:type="spellStart"/>
-      <w:r>
-        <w:rPr>
-          <w:highlight w:val="cyan"/>
-        </w:rPr>
-        <w:t>Ovary_R</w:t>
-      </w:r>
-      <w:proofErr w:type="spellEnd"/>
-    </w:p>
-    <w:p>
-      <w:pPr>
-        <w:spacing w:line="240" w:lineRule="auto"/>
-        <w:contextualSpacing/>
-      </w:pPr>
-      <w:proofErr w:type="spellStart"/>
-      <w:r>
-        <w:rPr>
-          <w:highlight w:val="cyan"/>
-        </w:rPr>
-        <w:t>Ovary_L</w:t>
-      </w:r>
-      <w:proofErr w:type="spellEnd"/>
-    </w:p>
-    <w:p>
-      <w:pPr>
-        <w:spacing w:line="240" w:lineRule="auto"/>
-        <w:contextualSpacing/>
-        <w:rPr>
-          <w:highlight w:val="yellow"/>
-        </w:rPr>
-      </w:pPr>
-      <w:proofErr w:type="spellStart"/>
-      <w:r>
-        <w:rPr>
-          <w:highlight w:val="yellow"/>
-        </w:rPr>
-        <w:t>Uterus</w:t>
-      </w:r>
-      <w:r>
-        <w:rPr>
-          <w:highlight w:val="yellow"/>
-        </w:rPr>
-        <w:t>_Cervix</w:t>
-      </w:r>
-      <w:proofErr w:type="spellEnd"/>
-      <w:r>
-        <w:rPr>
-          <w:highlight w:val="yellow"/>
-        </w:rPr>
+        <w:t>Brain</w:t>
+      </w:r>
+    </w:p>
+    <w:p>
+      <w:pPr>
+        <w:spacing w:line="240" w:lineRule="auto"/>
+        <w:contextualSpacing/>
+      </w:pPr>
+      <w:proofErr w:type="spellStart"/>
+      <w:r>
+        <w:t>SpinalC</w:t>
+      </w:r>
+      <w:r>
+        <w:t>anal</w:t>
+      </w:r>
+      <w:proofErr w:type="spellEnd"/>
+    </w:p>
+    <w:p>
+      <w:pPr>
+        <w:spacing w:line="240" w:lineRule="auto"/>
+        <w:contextualSpacing/>
+        <w:rPr>
+          <w:highlight w:val="yellow"/>
+        </w:rPr>
+      </w:pPr>
+      <w:r>
+        <w:rPr>
+          <w:highlight w:val="yellow"/>
+        </w:rPr>
+        <w:t>Liver</w:t>
+      </w:r>
+      <w:r>
+        <w:rPr>
+          <w:highlight w:val="yellow"/>
+        </w:rPr>
+        <w:t xml:space="preserve"> – Limbus</w:t>
+      </w:r>
+    </w:p>
+    <w:p>
+      <w:pPr>
+        <w:spacing w:line="240" w:lineRule="auto"/>
+        <w:contextualSpacing/>
+      </w:pPr>
+      <w:r>
+        <w:rPr>
+          <w:highlight w:val="yellow"/>
+        </w:rPr>
+        <w:t>Spleen - Limbus</w:t>
+      </w:r>
+      <w:r>
+        <w:t xml:space="preserve"> </w:t>
+      </w:r>
+    </w:p>
+    <w:p>
+      <w:pPr>
+        <w:spacing w:line="240" w:lineRule="auto"/>
+        <w:contextualSpacing/>
+        <w:rPr>
+          <w:highlight w:val="cyan"/>
+        </w:rPr>
+      </w:pPr>
+      <w:proofErr w:type="spellStart"/>
+      <w:r>
+        <w:rPr>
+          <w:highlight w:val="cyan"/>
+        </w:rPr>
+        <w:t>LymphNodes</w:t>
+      </w:r>
+      <w:proofErr w:type="spellEnd"/>
+    </w:p>
+    <w:p>
+      <w:pPr>
+        <w:spacing w:line="240" w:lineRule="auto"/>
+        <w:contextualSpacing/>
+        <w:rPr>
+          <w:highlight w:val="cyan"/>
+        </w:rPr>
+      </w:pPr>
+      <w:proofErr w:type="spellStart"/>
+      <w:r>
+        <w:rPr>
+          <w:highlight w:val="cyan"/>
+        </w:rPr>
+        <w:t>Bones_</w:t>
+      </w:r>
+      <w:r>
+        <w:rPr>
+          <w:highlight w:val="cyan"/>
+        </w:rPr>
+        <w:t>Trunk</w:t>
+      </w:r>
+      <w:proofErr w:type="spellEnd"/>
+    </w:p>
+    <w:p>
+      <w:pPr>
+        <w:spacing w:line="240" w:lineRule="auto"/>
+        <w:contextualSpacing/>
+      </w:pPr>
+      <w:proofErr w:type="spellStart"/>
+      <w:r>
+        <w:rPr>
+          <w:highlight w:val="yellow"/>
+        </w:rPr>
+        <w:t>Bone_</w:t>
+      </w:r>
+      <w:r>
+        <w:rPr>
+          <w:highlight w:val="yellow"/>
+        </w:rPr>
+        <w:t>Mandible</w:t>
+      </w:r>
+      <w:proofErr w:type="spellEnd"/>
+      <w:r>
         <w:t xml:space="preserve"> - Limbus</w:t>
       </w:r>
     </w:p>
@@ -865,143 +1106,18 @@
         <w:spacing w:line="240" w:lineRule="auto"/>
         <w:contextualSpacing/>
       </w:pPr>
-      <w:r>
-        <w:rPr>
-          <w:highlight w:val="cyan"/>
-        </w:rPr>
-        <w:t>Testes</w:t>
-      </w:r>
-      <w:r>
-        <w:rPr>
-          <w:highlight w:val="cyan"/>
-        </w:rPr>
-        <w:t xml:space="preserve"> </w:t>
-      </w:r>
-    </w:p>
-    <w:p>
-      <w:pPr>
-        <w:spacing w:line="240" w:lineRule="auto"/>
-        <w:contextualSpacing/>
-      </w:pPr>
-      <w:r>
-        <w:t>Brain</w:t>
-      </w:r>
-    </w:p>
-    <w:p>
-      <w:pPr>
-        <w:spacing w:line="240" w:lineRule="auto"/>
-        <w:contextualSpacing/>
-      </w:pPr>
-      <w:proofErr w:type="spellStart"/>
-      <w:r>
-        <w:t>SpinalCanal</w:t>
-      </w:r>
-      <w:proofErr w:type="spellEnd"/>
-    </w:p>
-    <w:p>
-      <w:pPr>
-        <w:spacing w:line="240" w:lineRule="auto"/>
-        <w:contextualSpacing/>
-        <w:rPr>
-          <w:highlight w:val="yellow"/>
-        </w:rPr>
-      </w:pPr>
-      <w:r>
-        <w:rPr>
-          <w:highlight w:val="yellow"/>
-        </w:rPr>
-        <w:t>Liver</w:t>
-      </w:r>
-      <w:r>
-        <w:rPr>
-          <w:highlight w:val="yellow"/>
-        </w:rPr>
-        <w:t xml:space="preserve"> – Limbus</w:t>
-      </w:r>
-    </w:p>
-    <w:p>
-      <w:pPr>
-        <w:spacing w:line="240" w:lineRule="auto"/>
-        <w:contextualSpacing/>
-      </w:pPr>
-      <w:r>
-        <w:rPr>
-          <w:highlight w:val="yellow"/>
-        </w:rPr>
-        <w:t>Spleen - Limbus</w:t>
-      </w:r>
-      <w:r>
-        <w:t xml:space="preserve"> </w:t>
-      </w:r>
-    </w:p>
-    <w:p>
-      <w:pPr>
-        <w:spacing w:line="240" w:lineRule="auto"/>
-        <w:contextualSpacing/>
-        <w:rPr>
-          <w:highlight w:val="cyan"/>
-        </w:rPr>
-      </w:pPr>
-      <w:proofErr w:type="spellStart"/>
-      <w:r>
-        <w:rPr>
-          <w:highlight w:val="cyan"/>
-        </w:rPr>
-        <w:t>LymphNodes</w:t>
-      </w:r>
-      <w:proofErr w:type="spellEnd"/>
-    </w:p>
-    <w:p>
-      <w:pPr>
-        <w:spacing w:line="240" w:lineRule="auto"/>
-        <w:contextualSpacing/>
-        <w:rPr>
-          <w:highlight w:val="cyan"/>
-        </w:rPr>
-      </w:pPr>
-      <w:proofErr w:type="spellStart"/>
-      <w:r>
-        <w:rPr>
-          <w:highlight w:val="cyan"/>
-        </w:rPr>
-        <w:t>Bones_Body</w:t>
-      </w:r>
-      <w:proofErr w:type="spellEnd"/>
-    </w:p>
-    <w:p>
-      <w:pPr>
-        <w:spacing w:line="240" w:lineRule="auto"/>
-        <w:contextualSpacing/>
-      </w:pPr>
-      <w:proofErr w:type="spellStart"/>
-      <w:r>
-        <w:rPr>
-          <w:highlight w:val="yellow"/>
-        </w:rPr>
-        <w:t>Bone_</w:t>
-      </w:r>
-      <w:r>
-        <w:rPr>
-          <w:highlight w:val="yellow"/>
-        </w:rPr>
-        <w:t>Mandible</w:t>
-      </w:r>
-      <w:proofErr w:type="spellEnd"/>
-      <w:r>
-        <w:t xml:space="preserve"> - Limbus</w:t>
-      </w:r>
-    </w:p>
-    <w:p>
-      <w:pPr>
-        <w:spacing w:line="240" w:lineRule="auto"/>
-        <w:contextualSpacing/>
-      </w:pPr>
       <w:proofErr w:type="spellStart"/>
       <w:r>
         <w:rPr>
           <w:highlight w:val="cyan"/>
         </w:rPr>
         <w:t>Bones_Extr</w:t>
+      </w:r>
+      <w:r>
+        <w:rPr>
+          <w:highlight w:val="cyan"/>
+        </w:rPr>
+        <w:t>em</w:t>
       </w:r>
       <w:proofErr w:type="spellEnd"/>
     </w:p>
@@ -1071,6 +1187,186 @@
         </w:drawing>
       </w:r>
     </w:p>
+    <w:p/>
+    <w:p/>
+    <w:p>
+      <w:r>
+        <w:t>To be looked at later:</w:t>
+      </w:r>
+    </w:p>
+    <w:p/>
+    <w:p>
+      <w:pPr>
+        <w:rPr>
+          <w:b/>
+          <w:bCs/>
+        </w:rPr>
+      </w:pPr>
+      <w:r>
+        <w:rPr>
+          <w:b/>
+          <w:bCs/>
+        </w:rPr>
+        <w:t xml:space="preserve">Prescription: 20 </w:t>
+      </w:r>
+      <w:proofErr w:type="spellStart"/>
+      <w:r>
+        <w:rPr>
+          <w:b/>
+          <w:bCs/>
+        </w:rPr>
+        <w:t>Gy</w:t>
+      </w:r>
+      <w:proofErr w:type="spellEnd"/>
+      <w:r>
+        <w:rPr>
+          <w:b/>
+          <w:bCs/>
+        </w:rPr>
+        <w:t xml:space="preserve"> in </w:t>
+      </w:r>
+      <w:r>
+        <w:rPr>
+          <w:b/>
+          <w:bCs/>
+        </w:rPr>
+        <w:t>10</w:t>
+      </w:r>
+      <w:r>
+        <w:rPr>
+          <w:b/>
+          <w:bCs/>
+        </w:rPr>
+        <w:t xml:space="preserve"> </w:t>
+      </w:r>
+      <w:proofErr w:type="spellStart"/>
+      <w:r>
+        <w:rPr>
+          <w:b/>
+          <w:bCs/>
+        </w:rPr>
+        <w:t>fx</w:t>
+      </w:r>
+      <w:proofErr w:type="spellEnd"/>
+      <w:r>
+        <w:rPr>
+          <w:b/>
+          <w:bCs/>
+        </w:rPr>
+        <w:t xml:space="preserve"> (12 </w:t>
+      </w:r>
+      <w:proofErr w:type="spellStart"/>
+      <w:r>
+        <w:rPr>
+          <w:b/>
+          <w:bCs/>
+        </w:rPr>
+        <w:t>Gy</w:t>
+      </w:r>
+      <w:proofErr w:type="spellEnd"/>
+      <w:r>
+        <w:rPr>
+          <w:b/>
+          <w:bCs/>
+        </w:rPr>
+        <w:t xml:space="preserve"> to liver and brain only)</w:t>
+      </w:r>
+    </w:p>
+    <w:p>
+      <w:r>
+        <w:t>PTV_TMLI_20 = [((</w:t>
+      </w:r>
+      <w:proofErr w:type="spellStart"/>
+      <w:r>
+        <w:t>Bones_Trunk</w:t>
+      </w:r>
+      <w:proofErr w:type="spellEnd"/>
+      <w:r>
+        <w:t xml:space="preserve"> – </w:t>
+      </w:r>
+      <w:proofErr w:type="spellStart"/>
+      <w:r>
+        <w:t>Bones_Face</w:t>
+      </w:r>
+      <w:proofErr w:type="spellEnd"/>
+      <w:r>
+        <w:t xml:space="preserve">) + </w:t>
+      </w:r>
+      <w:proofErr w:type="spellStart"/>
+      <w:r>
+        <w:t>LymphNodes</w:t>
+      </w:r>
+      <w:proofErr w:type="spellEnd"/>
+      <w:r>
+        <w:t xml:space="preserve"> + </w:t>
+      </w:r>
+      <w:proofErr w:type="spellStart"/>
+      <w:r>
+        <w:t>SpinalCanal</w:t>
+      </w:r>
+      <w:proofErr w:type="spellEnd"/>
+      <w:r>
+        <w:t xml:space="preserve"> + Spleen) + 5mm] + [(</w:t>
+      </w:r>
+      <w:proofErr w:type="spellStart"/>
+      <w:r>
+        <w:t>Bones_Extrem</w:t>
+      </w:r>
+      <w:proofErr w:type="spellEnd"/>
+      <w:r>
+        <w:t>) + 1cm] – [Lungs +5mm] – [Kidneys +5mm] – [Esophagus+5mm]</w:t>
+      </w:r>
+    </w:p>
+    <w:p>
+      <w:r>
+        <w:t>PTV_TMLI_12 = [Brain + Liver] + 5mm</w:t>
+      </w:r>
+    </w:p>
+    <w:p/>
+    <w:p>
+      <w:r>
+        <w:t>Other regimens</w:t>
+      </w:r>
+    </w:p>
+    <w:p>
+      <w:r>
+        <w:lastRenderedPageBreak/>
+        <w:t>PTV_TMLI = [((</w:t>
+      </w:r>
+      <w:proofErr w:type="spellStart"/>
+      <w:r>
+        <w:t>Bones_Body</w:t>
+      </w:r>
+      <w:proofErr w:type="spellEnd"/>
+      <w:r>
+        <w:t xml:space="preserve"> – Mandible) + </w:t>
+      </w:r>
+      <w:proofErr w:type="spellStart"/>
+      <w:r>
+        <w:t>LymphNodes</w:t>
+      </w:r>
+      <w:proofErr w:type="spellEnd"/>
+      <w:r>
+        <w:t xml:space="preserve"> + </w:t>
+      </w:r>
+      <w:proofErr w:type="spellStart"/>
+      <w:r>
+        <w:t>SpinalCanal</w:t>
+      </w:r>
+      <w:proofErr w:type="spellEnd"/>
+      <w:r>
+        <w:t xml:space="preserve"> + Spleen + Brain + Liver + Testes) + 5mm all around] + [(</w:t>
+      </w:r>
+      <w:proofErr w:type="spellStart"/>
+      <w:r>
+        <w:t>Bones_Extrem</w:t>
+      </w:r>
+      <w:proofErr w:type="spellEnd"/>
+      <w:r>
+        <w:t>) + 1cm all around] – [Lungs +5mm all around] – [Kidneys +5mm all around] – [Esophagus+5mm]</w:t>
+      </w:r>
+    </w:p>
+    <w:p/>
     <w:sectPr>
       <w:type w:val="continuous"/>
       <w:pgSz w:w="12240" w:h="15840"/>

</xml_diff>